<commit_message>
Keep CV claims strictly to documented experience
Co-Authored-By: Claude Opus 5.5 <noreply@anthropic.com>
Claude-Session: https://claude.ai/code/session_01GqW8cM2soKKzQ2aNFApto7
</commit_message>
<xml_diff>
--- a/Michael_Chuang_CV_ACD_Art.docx
+++ b/Michael_Chuang_CV_ACD_Art.docx
@@ -41,7 +41,7 @@
     </w:p>
     <w:p>
       <w:r>
-        <w:t>Art-led creative leader with 15+ years building social-first campaigns and high-volume content for major entertainment, consumer, and healthcare brands, including Netflix, STARZ, AstraZeneca, and GSK. Serves as the central creative authority across client portfolios: sets the visual direction, leads the teams who carry it out, and holds every deliverable to a high standard from idea through production and distribution. Partners closely with Strategy, Account, and Paid Media leads to turn audience insight and brand strategy into editorialized, platform-native content that drives engagement. Has mentored and managed designers, art directors, and developers; led pitch narratives and concept workshops that won client buy-in; and built design systems, templates, and brand toolkits that bring speed and cohesion to high-volume production. Hands-on in Figma, Adobe Creative Suite, After Effects, and Premiere, and an early adopter of AI tools (Midjourney, Adobe Firefly, Claude) to modernize creative operations.</w:t>
+        <w:t>Art-led creative leader with 15+ years building social-first campaigns and high-volume content for major entertainment, consumer, and healthcare brands, including Netflix, STARZ, AstraZeneca, and GSK. Serves as the central creative authority across client portfolios: sets the visual direction, leads the teams who carry it out, and holds every deliverable to a high standard from idea through production and distribution. Partners closely with Strategy, Account, and client leads to turn audience insight and brand strategy into editorialized, platform-native content that drives engagement. Has mentored and managed teams of designers and developers; led pitch narratives and concept workshops that won client buy-in; and built design systems, templates, and brand toolkits that bring speed and cohesion to high-volume production. Hands-on in Figma, Adobe Creative Suite, After Effects, and Premiere, and an early adopter of AI tools (Midjourney, Adobe Firefly, Claude) to modernize creative operations.</w:t>
       </w:r>
     </w:p>
     <w:p>
@@ -112,7 +112,7 @@
         <w:t>Collaboration:</w:t>
       </w:r>
       <w:r>
-        <w:t xml:space="preserve"> Cross-functional partnership (Strategy, Account, Paid Media, Production) · Client presentations · Integrated campaign planning &amp; workflow</w:t>
+        <w:t xml:space="preserve"> Cross-functional partnership (Strategy, Account, Production, Development) · Client presentations · Integrated campaign planning &amp; workflow</w:t>
       </w:r>
     </w:p>
     <w:p>

</xml_diff>

<commit_message>
Add STARZ team management and performance review details to all CVs
Co-Authored-By: Claude Opus 5.5 <noreply@anthropic.com>
Claude-Session: https://claude.ai/code/session_01GqW8cM2soKKzQ2aNFApto7
</commit_message>
<xml_diff>
--- a/Michael_Chuang_CV_ACD_Art.docx
+++ b/Michael_Chuang_CV_ACD_Art.docx
@@ -41,7 +41,7 @@
     </w:p>
     <w:p>
       <w:r>
-        <w:t>Art-led creative leader with 15+ years building social-first campaigns and high-volume content for major entertainment, consumer, and healthcare brands, including Netflix, STARZ, AstraZeneca, and GSK. Serves as the central creative authority across client portfolios: sets the visual direction, leads the teams who carry it out, and holds every deliverable to a high standard from idea through production and distribution. Partners closely with Strategy, Account, and client leads to turn audience insight and brand strategy into editorialized, platform-native content that drives engagement. Has mentored and managed teams of designers and developers; led pitch narratives and concept workshops that won client buy-in; and built design systems, templates, and brand toolkits that bring speed and cohesion to high-volume production. Hands-on in Figma, Adobe Creative Suite, After Effects, and Premiere, and an early adopter of AI tools (Midjourney, Adobe Firefly, Claude) to modernize creative operations.</w:t>
+        <w:t>Art-led creative leader with 15+ years building social-first campaigns and high-volume content for major entertainment, consumer, and healthcare brands, including Netflix, STARZ, AstraZeneca, and GSK. Serves as the central creative authority across client portfolios: sets the visual direction, leads the teams who carry it out, and holds every deliverable to a high standard from idea through production and distribution. Partners closely with Strategy, Account, and client leads to turn audience insight and brand strategy into editorialized, platform-native content that drives engagement. Has managed and mentored a team of 6 designers and developers, including annual performance reviews; led pitch narratives and concept workshops that won client buy-in; and built design systems, templates, and brand toolkits that bring speed and cohesion to high-volume production. Hands-on in Figma, Adobe Creative Suite, After Effects, and Premiere, and an early adopter of AI tools (Midjourney, Adobe Firefly, Claude) to modernize creative operations.</w:t>
       </w:r>
     </w:p>
     <w:p>
@@ -335,7 +335,15 @@
         <w:pStyle w:val="ListBullet"/>
       </w:pPr>
       <w:r>
-        <w:t>Supervised and mentored a team of designers and developers serving Digital Marketing, Originals Marketing, PR, and International teams, giving creative direction and feedback and helping team members grow.</w:t>
+        <w:t>Managed a team of 6 designers and developers, running annual performance reviews that directly shaped each person's annual bonus, and giving ongoing creative direction, feedback, and mentorship.</w:t>
+      </w:r>
+    </w:p>
+    <w:p>
+      <w:pPr>
+        <w:pStyle w:val="ListBullet"/>
+      </w:pPr>
+      <w:r>
+        <w:t>Led the team's work for Digital Marketing, Originals Marketing, PR, and International teams.</w:t>
       </w:r>
     </w:p>
     <w:p>

</xml_diff>

<commit_message>
Add STARZ hiring and candidate selection to leadership CVs
Co-Authored-By: Claude Opus 5.5 <noreply@anthropic.com>
Claude-Session: https://claude.ai/code/session_01GqW8cM2soKKzQ2aNFApto7
</commit_message>
<xml_diff>
--- a/Michael_Chuang_CV_ACD_Art.docx
+++ b/Michael_Chuang_CV_ACD_Art.docx
@@ -336,6 +336,14 @@
       </w:pPr>
       <w:r>
         <w:t>Managed a team of 6 designers and developers, running annual performance reviews that directly shaped each person's annual bonus, and giving ongoing creative direction, feedback, and mentorship.</w:t>
+      </w:r>
+    </w:p>
+    <w:p>
+      <w:pPr>
+        <w:pStyle w:val="ListBullet"/>
+      </w:pPr>
+      <w:r>
+        <w:t>Played a key role in hiring and selecting candidates for positions on the STARZ Interactive team.</w:t>
       </w:r>
     </w:p>
     <w:p>

</xml_diff>